<commit_message>
docs(juridico): las 4 migraciones aplicadas en produccion, informe al dia
Confirmado por el usuario: 0074-0077 aplicadas y verificadas en
produccion (los 4 controles de la consulta de verificacion dieron ok).

El informe para la asesoria (.md y .docx) actualiza la seccion sobre el
historial cerrado: pasa de "dos vias, con una salvedad sobre
internaciones pendiente" a "tres vias, las tres cerradas", incluyendo la
Via 3 (internaciones dadas de alta sin cobro, 0077) con su propio
parrafo de que decia el sistema y que se corrigio. Se quitan las
referencias sueltas a la salvedad en el resumen ejecutivo y en la tabla
de ejercicio de derechos, que citaban una seccion que ya no aplica.

Con esto el informe entregado a la asesoria refleja el estado real y
completo de la correccion, sin nada marcado como pendiente que ya no lo
esta.

Co-Authored-By: Claude Sonnet 5 <noreply@anthropic.com>
</commit_message>
<xml_diff>
--- a/Informe Vetora - Asesoria Juridica.docx
+++ b/Informe Vetora - Asesoria Juridica.docx
@@ -387,7 +387,7 @@
                 <w:sz w:val="19"/>
                 <w:szCs w:val="19"/>
               </w:rPr>
-              <w:t xml:space="preserve">La política afirmaba que el historial cerrado no se puede borrar — era cierto solo a medias</w:t>
+              <w:t xml:space="preserve">La política afirmaba que el historial cerrado no se puede borrar — era cierto solo a medias, por tres vías distintas</w:t>
             </w:r>
           </w:p>
         </w:tc>
@@ -413,7 +413,7 @@
                 <w:sz w:val="19"/>
                 <w:szCs w:val="19"/>
               </w:rPr>
-              <w:t xml:space="preserve">Corregido el mismo día, con una salvedad relacionada pendiente</w:t>
+              <w:t xml:space="preserve">Corregidas las tres vías el mismo día</w:t>
             </w:r>
           </w:p>
         </w:tc>
@@ -722,7 +722,7 @@
         <w:spacing w:after="140" w:before="280"/>
       </w:pPr>
       <w:r>
-        <w:t xml:space="preserve">2.2. «El historial clínico cerrado no se puede modificar ni borrar» — corregido, con una salvedad relacionada pendiente</w:t>
+        <w:t xml:space="preserve">2.2. «El historial clínico cerrado no se puede modificar ni borrar» — corregido (tres vías, las tres cerradas)</w:t>
       </w:r>
     </w:p>
     <w:p>
@@ -752,7 +752,7 @@
         <w:t xml:space="preserve">«Ni borrar»: </w:t>
       </w:r>
       <w:r>
-        <w:t xml:space="preserve">no estaba garantizado, y por dos vías distintas.</w:t>
+        <w:t xml:space="preserve">no estaba garantizado, y por tres vías distintas — la tercera se descubrió al cerrar las dos primeras.</w:t>
       </w:r>
     </w:p>
     <w:p>
@@ -780,10 +780,25 @@
           <w:bCs/>
           <w:color w:val="B91C1C"/>
         </w:rPr>
-        <w:t xml:space="preserve">Vía 2 — borrar la cita, no el paciente (la más grave de las dos). </w:t>
+        <w:t xml:space="preserve">Vía 2 — borrar la cita, no el paciente (la más grave de las tres). </w:t>
       </w:r>
       <w:r>
         <w:t xml:space="preserve">El historial clínico está vinculado a la cita en la que se generó, y al borrarse esa cita el historial se borraba con ella. Borrar una cita es una operación habitual del personal —cancelaciones, limpieza de agenda—, muy distinta de borrar un paciente entero. Cualquier miembro del personal podía, sin darse cuenta, destruir un expediente médico simplemente al borrar la cita asociada.</w:t>
+      </w:r>
+    </w:p>
+    <w:p>
+      <w:pPr>
+        <w:spacing w:after="140" w:line="276"/>
+      </w:pPr>
+      <w:r>
+        <w:rPr>
+          <w:b/>
+          <w:bCs/>
+        </w:rPr>
+        <w:t xml:space="preserve">Vía 3 — borrar el paciente arrastrando una internación ya cerrada. </w:t>
+      </w:r>
+      <w:r>
+        <w:t xml:space="preserve">El mismo problema de la vía 1, aplicado a otro tipo de registro: una internación ya concluida se prometía «congelada», pero solo frente a modificaciones, no frente a que se borrara el paciente completo. Sin ningún cobro asociado a esa internación, se perdía igual que el historial de la vía 1.</w:t>
       </w:r>
     </w:p>
     <w:p>
@@ -817,12 +832,12 @@
         <w:spacing w:after="90" w:line="276"/>
       </w:pPr>
       <w:r>
-        <w:t xml:space="preserve">La protección existente sobre el borrado de pacientes se amplió para bloquear también cuando el paciente tiene historiales clínicos cerrados. Un historial todavía en borrador no bloquea el borrado, porque un borrador no es el expediente médico definitivo que se promete conservar.</w:t>
-      </w:r>
-    </w:p>
-    <w:p>
-      <w:pPr>
-        <w:spacing w:after="140" w:line="276"/>
+        <w:t xml:space="preserve">La protección existente sobre el borrado de pacientes se amplió para bloquear también cuando el paciente tiene historiales clínicos cerrados, y cuando tiene internaciones ya concluidas. En ambos casos, lo que sigue en curso —una consulta sin terminar, una internación activa— no bloquea el borrado: solo se protege lo que ya se cerró y se promete definitivo.</w:t>
+      </w:r>
+    </w:p>
+    <w:p>
+      <w:pPr>
+        <w:spacing w:after="240" w:line="276"/>
       </w:pPr>
       <w:r>
         <w:rPr>
@@ -832,32 +847,7 @@
         <w:t xml:space="preserve">Estado: </w:t>
       </w:r>
       <w:r>
-        <w:t xml:space="preserve">ambas vías quedan cerradas. La política ya es cierta.</w:t>
-      </w:r>
-    </w:p>
-    <w:p>
-      <w:pPr>
-        <w:shd w:fill="FEF2F2" w:color="auto" w:val="clear"/>
-        <w:spacing w:after="80" w:line="276"/>
-      </w:pPr>
-      <w:r>
-        <w:rPr>
-          <w:b/>
-          <w:bCs/>
-          <w:color w:val="B91C1C"/>
-          <w:sz w:val="22"/>
-          <w:szCs w:val="22"/>
-        </w:rPr>
-        <w:t xml:space="preserve">Salvedad relacionada, detectada al corregir esto y aún pendiente</w:t>
-      </w:r>
-    </w:p>
-    <w:p>
-      <w:pPr>
-        <w:shd w:fill="FEF2F2" w:color="auto" w:val="clear"/>
-        <w:spacing w:after="200" w:line="276"/>
-      </w:pPr>
-      <w:r>
-        <w:t xml:space="preserve">El mismo tipo de problema afecta a las internaciones. Una internación sin ningún cobro asociado todavía puede perderse si se borra el paciente, pese a que el sistema declara las internaciones «congeladas» una vez dado el alta. Es una situación poco común, pero es el mismo patrón exacto que se acaba de corregir, aplicado a otro tipo de registro. Queda anotado para resolverse de la misma manera.</w:t>
+        <w:t xml:space="preserve">las tres vías quedan cerradas y verificadas en producción. La política ya es cierta en su totalidad.</w:t>
       </w:r>
     </w:p>
     <w:p>
@@ -3175,7 +3165,7 @@
                 <w:sz w:val="19"/>
                 <w:szCs w:val="19"/>
               </w:rPr>
-              <w:t xml:space="preserve">Indirecto; ver la salvedad sobre internaciones en el punto 2.2</w:t>
+              <w:t xml:space="preserve">Indirecto: debe solicitarse a la clínica</w:t>
             </w:r>
           </w:p>
         </w:tc>

</xml_diff>

<commit_message>
docs(juridico): amplia el punto sobre el CI en el informe con hechos verificados
Convierte la fila suelta de la seccion 2.1 en un apartado propio: que es
el CI tecnicamente (texto libre, sin validacion de formato, sin verificacion
real de identidad), para que se usa de verdad (heuristica de coincidencia en
vinculacion de portal y reuso de ficha, nunca prueba de identidad), y quien
lo ve hoy sin ninguna restriccion adicional (los tres roles de personal,
seis documentos impresos, el CSV completo del respaldo). La pregunta 4 de
la seccion 9 se abre en tres preguntas concretas apoyadas en esos hechos.

Co-Authored-By: Claude Sonnet 5 <noreply@anthropic.com>
</commit_message>
<xml_diff>
--- a/Informe Vetora - Asesoria Juridica.docx
+++ b/Informe Vetora - Asesoria Juridica.docx
@@ -1273,6 +1273,119 @@
     </w:tbl>
     <w:p>
       <w:pPr>
+        <w:shd w:fill="FEF2F2" w:color="auto" w:val="clear"/>
+        <w:spacing w:after="80" w:line="276"/>
+      </w:pPr>
+      <w:r>
+        <w:rPr>
+          <w:b/>
+          <w:bCs/>
+          <w:color w:val="B91C1C"/>
+          <w:sz w:val="22"/>
+          <w:szCs w:val="22"/>
+        </w:rPr>
+        <w:t xml:space="preserve">El CI merece punto propio</w:t>
+      </w:r>
+    </w:p>
+    <w:p>
+      <w:pPr>
+        <w:shd w:fill="FEF2F2" w:color="auto" w:val="clear"/>
+        <w:spacing w:after="200" w:line="276"/>
+      </w:pPr>
+      <w:r>
+        <w:t xml:space="preserve">Por lo que representa y por lo poco que el sistema lo distingue del resto de la ficha del cliente. Verificado contra el código, no supuesto.</w:t>
+      </w:r>
+    </w:p>
+    <w:p>
+      <w:pPr>
+        <w:pStyle w:val="ListParagraph"/>
+        <w:numPr>
+          <w:ilvl w:val="0"/>
+          <w:numId w:val="2"/>
+        </w:numPr>
+        <w:spacing w:after="90" w:line="276"/>
+      </w:pPr>
+      <w:r>
+        <w:rPr>
+          <w:b/>
+          <w:bCs/>
+        </w:rPr>
+        <w:t xml:space="preserve">Qué es hoy, técnicamente: </w:t>
+      </w:r>
+      <w:r>
+        <w:t xml:space="preserve">la columna (clientes.ci, desde la primera versión del esquema) es texto libre — sin restricción de unicidad, sin validación de formato, sin dígito verificador. Nunca se valida la longitud ni la forma de lo escrito, solo se recorta el espacio en blanco. Es opcional: una ficha puede no tenerlo.</w:t>
+      </w:r>
+    </w:p>
+    <w:p>
+      <w:pPr>
+        <w:pStyle w:val="ListParagraph"/>
+        <w:numPr>
+          <w:ilvl w:val="0"/>
+          <w:numId w:val="2"/>
+        </w:numPr>
+        <w:spacing w:after="90" w:line="276"/>
+      </w:pPr>
+      <w:r>
+        <w:rPr>
+          <w:b/>
+          <w:bCs/>
+        </w:rPr>
+        <w:t xml:space="preserve">Para qué se usa realmente: </w:t>
+      </w:r>
+      <w:r>
+        <w:t xml:space="preserve">nunca como control de acceso ni como prueba de identidad, sino como clave de coincidencia entre dos escrituras del mismo número, para dos decisiones concretas: vincular una cuenta nueva del portal a una ficha de cliente ya existente, y reusar la ficha de un dueño cuando se registra una segunda mascota a su nombre. El propio código del sistema lo dice sin rodeos: «No es prueba de identidad —los dos son datos que un conocido podría saber—, sube el listón de “sé tu carnet” a “sé tu carnet y tu teléfono”». Nadie en el sistema lo comprueba contra ningún documento ni servicio real — no existe integración con el registro civil boliviano ni con nada parecido: es autodeclarado de principio a fin.</w:t>
+      </w:r>
+    </w:p>
+    <w:p>
+      <w:pPr>
+        <w:pStyle w:val="ListParagraph"/>
+        <w:numPr>
+          <w:ilvl w:val="0"/>
+          <w:numId w:val="2"/>
+        </w:numPr>
+        <w:spacing w:after="90" w:line="276"/>
+      </w:pPr>
+      <w:r>
+        <w:rPr>
+          <w:b/>
+          <w:bCs/>
+        </w:rPr>
+        <w:t xml:space="preserve">Quién lo ve, sin ninguna restricción adicional a la de cualquier otro dato de la ficha: </w:t>
+      </w:r>
+      <w:r>
+        <w:t xml:space="preserve">los tres roles de personal por igual —administración, veterinario, recepción; la política de acceso de la base de datos no distingue esta columna de las demás—, el propio dueño desde su portal, seis documentos que se imprimen (cuatro de ellos accesibles también al dueño, por ser su propio dato), y el volcado completo del respaldo en formato CSV, que puede generar tanto la administración como recepción sin que esa columna se excluya. El operador de la plataforma también puede extraerlo clínica por clínica, pero eso ya está acotado con segundo factor y registrado en bitácora (sección 2.1).</w:t>
+      </w:r>
+    </w:p>
+    <w:p>
+      <w:pPr>
+        <w:pStyle w:val="ListParagraph"/>
+        <w:numPr>
+          <w:ilvl w:val="0"/>
+          <w:numId w:val="2"/>
+        </w:numPr>
+        <w:spacing w:after="140" w:line="276"/>
+      </w:pPr>
+      <w:r>
+        <w:rPr>
+          <w:b/>
+          <w:bCs/>
+        </w:rPr>
+        <w:t xml:space="preserve">Lo que no cambia: </w:t>
+      </w:r>
+      <w:r>
+        <w:t xml:space="preserve">sigue sin enviarse nunca al asistente de inteligencia artificial — reverificado al ampliar este punto.</w:t>
+      </w:r>
+    </w:p>
+    <w:p>
+      <w:pPr>
+        <w:spacing w:after="240" w:line="276"/>
+      </w:pPr>
+      <w:r>
+        <w:t xml:space="preserve">Es "el dato más sensible que se conserva" por lo que representa —identifica a una persona de forma unívoca en Bolivia—, no porque el sistema lo trate con un régimen distinto al resto de la ficha del cliente. Esa distancia entre lo sensible que es y lo poco que se lo distingue es justo lo que las preguntas 4.1 a 4.3 de la sección 9 le piden a la asesoría.</w:t>
+      </w:r>
+    </w:p>
+    <w:p>
+      <w:pPr>
         <w:pStyle w:val="Heading2"/>
         <w:spacing w:after="140" w:before="280"/>
       </w:pPr>
@@ -3607,10 +3720,37 @@
           <w:b/>
           <w:bCs/>
         </w:rPr>
-        <w:t xml:space="preserve">¿La cédula de identidad tiene un régimen especial de protección en Bolivia? </w:t>
-      </w:r>
-      <w:r>
-        <w:t xml:space="preserve">Es el identificador más sensible que se conserva y se emplea para vincular cuentas.</w:t>
+        <w:t xml:space="preserve">Sobre la cédula de identidad, </w:t>
+      </w:r>
+      <w:r>
+        <w:t xml:space="preserve">ampliado con los hechos verificados en la sección 3.1:</w:t>
+      </w:r>
+    </w:p>
+    <w:p>
+      <w:pPr>
+        <w:spacing w:after="90" w:line="276"/>
+        <w:ind w:left="720"/>
+      </w:pPr>
+      <w:r>
+        <w:t xml:space="preserve">4.1. ¿Tiene el CI boliviano un régimen jurídico especial (dato sensible o de categoría reforzada) que exija medidas más allá de las que ya existen?</w:t>
+      </w:r>
+    </w:p>
+    <w:p>
+      <w:pPr>
+        <w:spacing w:after="90" w:line="276"/>
+        <w:ind w:left="720"/>
+      </w:pPr>
+      <w:r>
+        <w:t xml:space="preserve">4.2. ¿Es jurídicamente aceptable que se use solo como clave de coincidencia autodeclarada, nunca verificada contra un documento real, tal como el propio sistema lo documenta y lo limita?</w:t>
+      </w:r>
+    </w:p>
+    <w:p>
+      <w:pPr>
+        <w:spacing w:after="130" w:line="276"/>
+        <w:ind w:left="720"/>
+      </w:pPr>
+      <w:r>
+        <w:t xml:space="preserve">4.3. ¿El nivel de exposición actual —igual para los tres roles de personal, impreso en varios documentos, volcado íntegro en el respaldo en CSV— es adecuado para "el dato más sensible que se guarda", o debería acotarse (por ejemplo, ocultarlo a algún rol, excluirlo del CSV, o enmascararlo en lo impreso)?</w:t>
       </w:r>
     </w:p>
     <w:p>

</xml_diff>

<commit_message>
docs(juridico): amplia el punto sobre firmas manuscritas con hechos verificados
Corrige una imprecision del informe: son dos tablas con firma, no tres (el
recibo reutiliza informes_firmados con tipo='recibo', no tiene tabla propia).
Anade lo verificado contra el codigo: solo se guarda la imagen rasterizada
del trazo, nunca presion/velocidad/secuencia de puntos (no hay biometria
dinamica); cuando la firma es obligatoria; que las dos tablas son solo
INSERT/SELECT; quien puede leer cada firma (el dueno ve incluso la firma
del veterinario en consentimientos, pero nunca la del recibo); que sale
integra en el CSV del respaldo sin filtro, a diferencia de la foto del
paciente; y que nunca se compara contra ninguna referencia. La pregunta 3
de la seccion 9 se abre en tres preguntas concretas (3.a-3.c) apoyadas en
esos hechos.

Co-Authored-By: Claude Sonnet 5 <noreply@anthropic.com>
</commit_message>
<xml_diff>
--- a/Informe Vetora - Asesoria Juridica.docx
+++ b/Informe Vetora - Asesoria Juridica.docx
@@ -1424,7 +1424,7 @@
         <w:spacing w:after="140" w:before="280"/>
       </w:pPr>
       <w:r>
-        <w:t xml:space="preserve">3.4. Firmas manuscritas</w:t>
+        <w:t xml:space="preserve">3.4. Firmas manuscritas — merece punto propio</w:t>
       </w:r>
     </w:p>
     <w:p>
@@ -1432,17 +1432,14 @@
         <w:spacing w:after="140" w:line="276"/>
       </w:pPr>
       <w:r>
-        <w:t xml:space="preserve">Tres tablas del sistema conservan </w:t>
-      </w:r>
-      <w:r>
-        <w:rPr>
-          <w:b/>
-          <w:bCs/>
-        </w:rPr>
-        <w:t xml:space="preserve">firmas manuscritas capturadas en el dispositivo</w:t>
-      </w:r>
-      <w:r>
-        <w:t xml:space="preserve"> (consentimientos de cirugía, informes firmados y recibos), almacenadas como imagen codificada.</w:t>
+        <w:rPr>
+          <w:b/>
+          <w:bCs/>
+        </w:rPr>
+        <w:t xml:space="preserve">Dos tablas</w:t>
+      </w:r>
+      <w:r>
+        <w:t xml:space="preserve"> del sistema conservan firmas manuscritas capturadas en el dispositivo, en base64 —no tres, como decía una versión anterior de este informe—: consentimientos de cirugía e informes firmados, tabla esta última donde también vive la firma de recibos (no es una tabla propia: solo añade "recibo" como un valor más de tipo de documento).</w:t>
       </w:r>
     </w:p>
     <w:p>
@@ -1458,7 +1455,7 @@
           <w:sz w:val="22"/>
           <w:szCs w:val="22"/>
         </w:rPr>
-        <w:t xml:space="preserve">Cuestión no planteada hasta ahora</w:t>
+        <w:t xml:space="preserve">Verificado contra el código, no supuesto</w:t>
       </w:r>
     </w:p>
     <w:p>
@@ -1467,7 +1464,135 @@
         <w:spacing w:after="200" w:line="276"/>
       </w:pPr>
       <w:r>
-        <w:t xml:space="preserve">Una firma manuscrita capturada digitalmente puede tener la consideración de dato biométrico o de categoría especial en determinados ordenamientos. Es una pregunta directa para la asesoría y afecta a tres tablas del sistema.</w:t>
+        <w:t xml:space="preserve">Los puntos siguientes están comprobados uno por uno contra el componente de captura y las políticas de acceso reales, no son una descripción general.</w:t>
+      </w:r>
+    </w:p>
+    <w:p>
+      <w:pPr>
+        <w:pStyle w:val="ListParagraph"/>
+        <w:numPr>
+          <w:ilvl w:val="0"/>
+          <w:numId w:val="2"/>
+        </w:numPr>
+        <w:spacing w:after="90" w:line="276"/>
+      </w:pPr>
+      <w:r>
+        <w:rPr>
+          <w:b/>
+          <w:bCs/>
+        </w:rPr>
+        <w:t xml:space="preserve">Qué es exactamente lo que se guarda: </w:t>
+      </w:r>
+      <w:r>
+        <w:t xml:space="preserve">un único componente de todo el sistema captura el trazo sobre un lienzo digital y, al soltar, lo convierte en una imagen estática. Solo se persiste esa imagen final — nunca la secuencia de puntos, la velocidad ni la presión del trazo, que existen momentáneamente en pantalla mientras se dibuja pero se descartan de inmediato y no llegan a guardarse en ningún campo. Es el equivalente digital de una foto de una firma en papel, no un dato biométrico dinámico.</w:t>
+      </w:r>
+    </w:p>
+    <w:p>
+      <w:pPr>
+        <w:pStyle w:val="ListParagraph"/>
+        <w:numPr>
+          <w:ilvl w:val="0"/>
+          <w:numId w:val="2"/>
+        </w:numPr>
+        <w:spacing w:after="90" w:line="276"/>
+      </w:pPr>
+      <w:r>
+        <w:rPr>
+          <w:b/>
+          <w:bCs/>
+        </w:rPr>
+        <w:t xml:space="preserve">Cuándo es obligatoria: </w:t>
+      </w:r>
+      <w:r>
+        <w:t xml:space="preserve">para el consentimiento firmado digitalmente —uno de sus tres métodos posibles; los otros dos (firma física escaneada, aceptación verbal registrada) no producen ningún trazo—, y como condición para imprimir un informe, un historial o un recibo: el botón de imprimir permanece deshabilitado sin firma. No es obligatoria para cerrar una consulta ni para cobrar — firmar es un paso posterior y separado, solo para poder emitir el papel.</w:t>
+      </w:r>
+    </w:p>
+    <w:p>
+      <w:pPr>
+        <w:pStyle w:val="ListParagraph"/>
+        <w:numPr>
+          <w:ilvl w:val="0"/>
+          <w:numId w:val="2"/>
+        </w:numPr>
+        <w:spacing w:after="90" w:line="276"/>
+      </w:pPr>
+      <w:r>
+        <w:rPr>
+          <w:b/>
+          <w:bCs/>
+        </w:rPr>
+        <w:t xml:space="preserve">Inmutabilidad: </w:t>
+      </w:r>
+      <w:r>
+        <w:t xml:space="preserve">las dos tablas son solo de alta y de lectura — no existe ninguna forma de modificar ni borrar una firma ya guardada, con la misma salvedad de las bajas en cadena ya explicada en el punto 2.2 de este informe.</w:t>
+      </w:r>
+    </w:p>
+    <w:p>
+      <w:pPr>
+        <w:pStyle w:val="ListParagraph"/>
+        <w:numPr>
+          <w:ilvl w:val="0"/>
+          <w:numId w:val="2"/>
+        </w:numPr>
+        <w:spacing w:after="90" w:line="276"/>
+      </w:pPr>
+      <w:r>
+        <w:rPr>
+          <w:b/>
+          <w:bCs/>
+        </w:rPr>
+        <w:t xml:space="preserve">Quién la ve: </w:t>
+      </w:r>
+      <w:r>
+        <w:t xml:space="preserve">el personal con acceso al expediente clínico (administración, veterinario, recepción), y el propio dueño desde su portal —incluida la firma del veterinario, no solo la suya— para los consentimientos e informes de su mascota. La única excepción es el recibo: al no llevar paciente asociado, esa firma queda estructuralmente invisible para el dueño aunque conozca la dirección del documento.</w:t>
+      </w:r>
+    </w:p>
+    <w:p>
+      <w:pPr>
+        <w:pStyle w:val="ListParagraph"/>
+        <w:numPr>
+          <w:ilvl w:val="0"/>
+          <w:numId w:val="2"/>
+        </w:numPr>
+        <w:spacing w:after="90" w:line="276"/>
+      </w:pPr>
+      <w:r>
+        <w:rPr>
+          <w:b/>
+          <w:bCs/>
+        </w:rPr>
+        <w:t xml:space="preserve">Sale íntegra en el respaldo en CSV </w:t>
+      </w:r>
+      <w:r>
+        <w:t xml:space="preserve">de ambas tablas, sin ningún filtro —al contrario que la fotografía del paciente, que sí se excluye del CSV y se mueve aparte—, y nunca se envía al asistente de inteligencia artificial.</w:t>
+      </w:r>
+    </w:p>
+    <w:p>
+      <w:pPr>
+        <w:pStyle w:val="ListParagraph"/>
+        <w:numPr>
+          <w:ilvl w:val="0"/>
+          <w:numId w:val="2"/>
+        </w:numPr>
+        <w:spacing w:after="140" w:line="276"/>
+      </w:pPr>
+      <w:r>
+        <w:rPr>
+          <w:b/>
+          <w:bCs/>
+        </w:rPr>
+        <w:t xml:space="preserve">Nunca se compara contra ninguna firma de referencia. </w:t>
+      </w:r>
+      <w:r>
+        <w:t xml:space="preserve">Se guarda y se muestra, pero no hay ningún proceso de verificación: es evidencia de que alguien trazó algo en el dispositivo en ese momento, no una comprobación de identidad.</w:t>
+      </w:r>
+    </w:p>
+    <w:p>
+      <w:pPr>
+        <w:spacing w:after="240" w:line="276"/>
+      </w:pPr>
+      <w:r>
+        <w:t xml:space="preserve">Es sensible en un sentido distinto al de la cédula de identidad (sección 3.1): no identifica por sí sola a nadie de forma unívoca, pero su naturaleza —un trazo manuscrito capturado digitalmente— es justo lo que algunas jurisdicciones tratan como dato biométrico o de categoría especial, sin que el sistema le dé hoy ningún tratamiento reforzado frente al resto del expediente.</w:t>
       </w:r>
     </w:p>
     <w:p>
@@ -3700,10 +3825,37 @@
           <w:b/>
           <w:bCs/>
         </w:rPr>
-        <w:t xml:space="preserve">¿Una firma manuscrita capturada en pantalla constituye dato biométrico </w:t>
-      </w:r>
-      <w:r>
-        <w:t xml:space="preserve">o de categoría especial? Afecta a tres tablas del sistema.</w:t>
+        <w:t xml:space="preserve">Sobre las firmas manuscritas, </w:t>
+      </w:r>
+      <w:r>
+        <w:t xml:space="preserve">ampliado con los hechos verificados en la sección 3.4 (afecta a dos tablas, no tres):</w:t>
+      </w:r>
+    </w:p>
+    <w:p>
+      <w:pPr>
+        <w:spacing w:after="90" w:line="276"/>
+        <w:ind w:left="720"/>
+      </w:pPr>
+      <w:r>
+        <w:t xml:space="preserve">3.a. ¿Una imagen estática del trazo final —sin presión, velocidad ni secuencia de puntos— sigue considerándose dato biométrico, o esa calificación exige el componente dinámico que aquí no se guarda?</w:t>
+      </w:r>
+    </w:p>
+    <w:p>
+      <w:pPr>
+        <w:spacing w:after="90" w:line="276"/>
+        <w:ind w:left="720"/>
+      </w:pPr>
+      <w:r>
+        <w:t xml:space="preserve">3.b. Si se considera dato sensible de todos modos, ¿bastan las protecciones ya existentes (inmutabilidad, acceso acotado al personal con expediente y al propio dueño), o hace falta algo adicional —por ejemplo, excluirla del respaldo en CSV, como ya se hace con la fotografía del paciente?</w:t>
+      </w:r>
+    </w:p>
+    <w:p>
+      <w:pPr>
+        <w:spacing w:after="130" w:line="276"/>
+        <w:ind w:left="720"/>
+      </w:pPr>
+      <w:r>
+        <w:t xml:space="preserve">3.c. ¿Cambia algo que el dueño pueda ver también la firma del veterinario, no solo la suya, en el consentimiento de su propia mascota?</w:t>
       </w:r>
     </w:p>
     <w:p>

</xml_diff>

<commit_message>
docs(juridico): cierra la pregunta de responsable/encargado - confirmada por el abogado
El abogado confirmo la calificacion: Vetora es encargada del tratamiento,
cada clinica es responsable. Actualiza el resumen ejecutivo y la pregunta 1
del informe principal, el orden de notificacion del procedimiento de
brechas (que dependia de esta respuesta), y marca como resuelta la
solicitud de calificacion detallada.

Co-Authored-By: Claude Sonnet 5 <noreply@anthropic.com>
</commit_message>
<xml_diff>
--- a/Informe Vetora - Asesoria Juridica.docx
+++ b/Informe Vetora - Asesoria Juridica.docx
@@ -583,6 +583,8 @@
             </w:pPr>
             <w:r>
               <w:rPr>
+                <w:b/>
+                <w:bCs/>
                 <w:sz w:val="19"/>
                 <w:szCs w:val="19"/>
               </w:rPr>
@@ -606,10 +608,13 @@
             </w:pPr>
             <w:r>
               <w:rPr>
-                <w:sz w:val="19"/>
-                <w:szCs w:val="19"/>
-              </w:rPr>
-              <w:t xml:space="preserve">Calificación jurídica pendiente</w:t>
+                <w:b/>
+                <w:bCs/>
+                <w:color w:val="0F766E"/>
+                <w:sz w:val="19"/>
+                <w:szCs w:val="19"/>
+              </w:rPr>
+              <w:t xml:space="preserve">Confirmado por la asesoría: Vetora es encargada, cada clínica es responsable</w:t>
             </w:r>
           </w:p>
         </w:tc>
@@ -3784,11 +3789,12 @@
         <w:rPr>
           <w:b/>
           <w:bCs/>
-        </w:rPr>
-        <w:t xml:space="preserve">¿Vetora es responsable o encargado del tratamiento? ¿Y la clínica? </w:t>
-      </w:r>
-      <w:r>
-        <w:t xml:space="preserve">La política contenía una afirmación al respecto y se retiró precisamente por tratarse de una calificación jurídica. De la respuesta depende quién responde frente al titular de los datos.</w:t>
+          <w:color w:val="0F766E"/>
+        </w:rPr>
+        <w:t xml:space="preserve">Respondido por la asesoría: </w:t>
+      </w:r>
+      <w:r>
+        <w:t xml:space="preserve">Vetora es encargada, cada clínica es responsable — la misma relación que cualquier proveedor de software tiene con su cliente. Queda por trasladar esa calificación al contrato con las clínicas.</w:t>
       </w:r>
     </w:p>
     <w:p>

</xml_diff>

<commit_message>
docs(juridico): agrega veredicto final - sin impedimento para operar comercialmente
El usuario pregunto si ya puede vender el producto. Respuesta directa,
grounded en lo ya verificado: 0 hallazgos criticos o altos abiertos en el
retest de seguridad, politica de privacidad veraz, los 3 DPA evaluados,
responsable/encargado confirmado por la asesoria. Lo unico pendiente antes
de firmar con una clinica de pago es completar y hacer revisar el contrato
(dato administrativo, no bloqueo tecnico ni de seguridad).

Co-Authored-By: Claude Sonnet 5 <noreply@anthropic.com>
</commit_message>
<xml_diff>
--- a/Informe Vetora - Asesoria Juridica.docx
+++ b/Informe Vetora - Asesoria Juridica.docx
@@ -635,6 +635,48 @@
         </w:tc>
       </w:tr>
     </w:tbl>
+    <w:p>
+      <w:pPr>
+        <w:pStyle w:val="Heading2"/>
+        <w:spacing w:after="140" w:before="280"/>
+      </w:pPr>
+      <w:r>
+        <w:t xml:space="preserve">Veredicto a 9 de septiembre de 2026: sin impedimento para operar comercialmente</w:t>
+      </w:r>
+    </w:p>
+    <w:p>
+      <w:pPr>
+        <w:spacing w:after="140" w:line="276"/>
+      </w:pPr>
+      <w:r>
+        <w:t xml:space="preserve">De los siete puntos, los siete están cerrados o acotados a una acción de bajo riesgo. </w:t>
+      </w:r>
+      <w:r>
+        <w:rPr>
+          <w:b/>
+          <w:bCs/>
+        </w:rPr>
+        <w:t xml:space="preserve">No queda ningún hallazgo de seguridad crítico ni alto abierto </w:t>
+      </w:r>
+      <w:r>
+        <w:t xml:space="preserve">(ver el retest completo en el registro de seguridad: 0 críticos y 9 altos, todos corregidos): lo único sin verificar en vivo son cuatro invariantes de caja e inventario que existen en el código y en producción, pero cuyo disparo real no se ha observado con dos clínicas simultáneas — no son un riesgo de que una clínica vea datos de otra, sino de que una regla de negocio interna falle silenciosamente. Legalmente, la política de privacidad es veraz, los tres proveedores tienen DPA vigente, y la calificación de responsable y encargado ya la confirmó la asesoría.</w:t>
+      </w:r>
+    </w:p>
+    <w:p>
+      <w:pPr>
+        <w:spacing w:after="240" w:line="276"/>
+      </w:pPr>
+      <w:r>
+        <w:rPr>
+          <w:b/>
+          <w:bCs/>
+        </w:rPr>
+        <w:t xml:space="preserve">Lo único pendiente antes de firmar con una clínica de pago es completar y hacer revisar el Contrato Vetora-Clínica </w:t>
+      </w:r>
+      <w:r>
+        <w:t xml:space="preserve">(los datos entre corchetes, y una revisión de forma del abogado). No es un bloqueo técnico ni de seguridad — es la pieza de papel que formaliza lo que el sistema ya hace correctamente.</w:t>
+      </w:r>
+    </w:p>
     <w:p>
       <w:r>
         <w:br w:type="page"/>

</xml_diff>

<commit_message>
fix(respaldo): la Edge Function no estaba desplegada con el codigo de la bitacora
Hallazgo real del mini-retest: registro_respaldos existia en la base y el
codigo de registrarUso() estaba en el repositorio desde H-30, pero
respaldo-clinica nunca se redesplegó despues de ese cambio -git push no
despliega Edge Functions-. La bitacora prometida en la politica de
privacidad no se escribia nunca en produccion hasta hoy.

Corregido: se desplego la funcion (supabase functions deploy
respaldo-clinica) y se verifico con un respaldo real desde Plataforma ->
Clinicas -> aparecio la fila correspondiente en registro_respaldos con el
usuario, la clinica, la accion y el resultado correctos. Los 4 controles
de forma agregados ayer a estado_rls.sql tambien se corrieron: 0 fallas.

H-30 y el punto 6.1 del informe juridico quedan verificados en produccion,
no solo en el codigo.

Co-Authored-By: Claude Sonnet 5 <noreply@anthropic.com>
</commit_message>
<xml_diff>
--- a/Informe Vetora - Asesoria Juridica.docx
+++ b/Informe Vetora - Asesoria Juridica.docx
@@ -765,7 +765,7 @@
     </w:p>
     <w:p>
       <w:pPr>
-        <w:spacing w:after="240" w:line="276"/>
+        <w:spacing w:after="140" w:line="276"/>
       </w:pPr>
       <w:r>
         <w:rPr>
@@ -776,6 +776,31 @@
       </w:r>
       <w:r>
         <w:t xml:space="preserve">la política ya es cierta tal como está redactada. No fue necesario cambiar el texto.</w:t>
+      </w:r>
+    </w:p>
+    <w:p>
+      <w:pPr>
+        <w:shd w:fill="FEF2F2" w:color="auto" w:val="clear"/>
+        <w:spacing w:after="80" w:line="276"/>
+      </w:pPr>
+      <w:r>
+        <w:rPr>
+          <w:b/>
+          <w:bCs/>
+          <w:color w:val="B91C1C"/>
+          <w:sz w:val="22"/>
+          <w:szCs w:val="22"/>
+        </w:rPr>
+        <w:t xml:space="preserve">Verificado en vivo el 9 de septiembre de 2026, no solo en el código</w:t>
+      </w:r>
+    </w:p>
+    <w:p>
+      <w:pPr>
+        <w:shd w:fill="FEF2F2" w:color="auto" w:val="clear"/>
+        <w:spacing w:after="200" w:line="276"/>
+      </w:pPr>
+      <w:r>
+        <w:t xml:space="preserve">La corrección se había aplicado en el repositorio, pero la función en la nube no estaba desplegada con ese código —publicar el código no despliega automáticamente las funciones—, así que hasta ese día la bitácora existía en la base pero no se escribía nunca. Se desplegó, se ejecutó un respaldo real desde el panel de la plataforma, y apareció la fila correspondiente con el usuario, la clínica, la acción y el resultado correctos.</w:t>
       </w:r>
     </w:p>
     <w:p>

</xml_diff>